<commit_message>
Update Rose affidavits for Investment Services manager
</commit_message>
<xml_diff>
--- a/Project Rooms/Credit Worthiness Evaluator/outputs/26-06-08 320 Rose Ever Amarildo Cardoza Bolanos - Affidavit of Business Judgment Approval Direction.docx
+++ b/Project Rooms/Credit Worthiness Evaluator/outputs/26-06-08 320 Rose Ever Amarildo Cardoza Bolanos - Affidavit of Business Judgment Approval Direction.docx
@@ -48,7 +48,7 @@
         <w:spacing w:after="120" w:line="259" w:lineRule="auto"/>
       </w:pPr>
       <w:r>
-        <w:t>I, Wes Browning, being first duly sworn, state as follows:</w:t>
+        <w:t>I, Al Bennett, being first duly sworn, state as follows:</w:t>
       </w:r>
     </w:p>
     <w:p>
@@ -57,7 +57,7 @@
         <w:spacing w:after="100"/>
       </w:pPr>
       <w:r>
-        <w:t>I am authorized to give business direction for Sell Your Home regarding the proposed seller-financed transaction for 320 Rose Pl.</w:t>
+        <w:t>I am Manager of Investment Services LLC, which is authorized to act as Manager for Sell Your Home regarding the proposed seller-financed transaction for 320 Rose Pl.</w:t>
       </w:r>
     </w:p>
     <w:p>
@@ -120,7 +120,7 @@
         <w:spacing w:after="100"/>
       </w:pPr>
       <w:r>
-        <w:t>Based on the total file, including related-company rent history, limited payment shock, credit history, receipt-supported gross receipts, and reserve support, I direct that Sell Your Home may treat the buyer as approved from a business-judgment standpoint, subject only to final legal document preparation, title/closing requirements, and any non-waivable legal or compliance requirements.</w:t>
+        <w:t>Based on the total file, including related-company rent history, limited payment shock, credit history, receipt-supported gross receipts, and reserve support, I direct that Sell Your Home, acting through Investment Services LLC as Manager, may treat the buyer as approved from a business-judgment standpoint, subject only to final legal document preparation, title/closing requirements, and any non-waivable legal or compliance requirements.</w:t>
       </w:r>
     </w:p>
     <w:p>
@@ -151,9 +151,14 @@
       </w:r>
     </w:p>
     <w:p>
+      <w:r/>
+    </w:p>
+    <w:p>
+      <w:pPr>
+        <w:spacing w:after="120" w:line="259" w:lineRule="auto"/>
+      </w:pPr>
       <w:r>
-        <w:br/>
-        <w:t>________________________________________</w:t>
+        <w:t>SELL YOUR HOME</w:t>
       </w:r>
     </w:p>
     <w:p>
@@ -161,49 +166,51 @@
         <w:spacing w:after="120" w:line="259" w:lineRule="auto"/>
       </w:pPr>
       <w:r>
-        <w:t>Wes Browning</w:t>
+        <w:t>By: Investment Services LLC, Manager</w:t>
       </w:r>
     </w:p>
     <w:p>
       <w:pPr>
         <w:spacing w:after="120" w:line="259" w:lineRule="auto"/>
       </w:pPr>
+      <w:r/>
+    </w:p>
+    <w:p>
       <w:r>
-        <w:t>Authorized Representative</w:t>
+        <w:t>By: ________________________________________</w:t>
+      </w:r>
+    </w:p>
+    <w:p>
+      <w:r>
+        <w:t>Al Bennett, Manager of Investment Services LLC</w:t>
       </w:r>
     </w:p>
     <w:p>
       <w:pPr>
         <w:spacing w:after="120" w:line="259" w:lineRule="auto"/>
       </w:pPr>
-      <w:r>
-        <w:t>Sell Your Home</w:t>
-      </w:r>
-    </w:p>
-    <w:p>
-      <w:r>
-        <w:br/>
-        <w:t>Sworn to and subscribed before me this _____ day of ____________________, 2026.</w:t>
-      </w:r>
-    </w:p>
-    <w:p>
-      <w:r>
-        <w:br/>
-        <w:t>________________________________________</w:t>
-      </w:r>
+      <w:r/>
     </w:p>
     <w:p>
       <w:pPr>
         <w:spacing w:after="120" w:line="259" w:lineRule="auto"/>
       </w:pPr>
       <w:r>
+        <w:t>Sworn to and subscribed before me this _____ day of ____________________, 2026.</w:t>
+      </w:r>
+    </w:p>
+    <w:p/>
+    <w:p>
+      <w:r>
+        <w:t>________________________________________</w:t>
+      </w:r>
+    </w:p>
+    <w:p>
+      <w:r>
         <w:t>Notary Public</w:t>
       </w:r>
     </w:p>
     <w:p>
-      <w:pPr>
-        <w:spacing w:after="120" w:line="259" w:lineRule="auto"/>
-      </w:pPr>
       <w:r>
         <w:t>My Commission Expires: ____________________</w:t>
       </w:r>

</xml_diff>